<commit_message>
Ajout de l'expertise Roanne ZAC Foch Sully à la liste des dépôts PKI
Co-Authored-By: Claude Fable 5.1 <noreply@anthropic.com>
Claude-Session: https://claude.ai/code/session_01LTHCphBGhJu898bYN1bWz5
</commit_message>
<xml_diff>
--- a/exports/PKI - Documents déposés depuis le 5 octobre 2026.docx
+++ b/exports/PKI - Documents déposés depuis le 5 octobre 2026.docx
@@ -50,7 +50,7 @@
           <w:b/>
           <w:bCs/>
         </w:rPr>
-        <w:t xml:space="preserve">26 documents ajoutés sur la semaine.</w:t>
+        <w:t xml:space="preserve">27 documents ajoutés sur la semaine.</w:t>
       </w:r>
     </w:p>
     <w:p>
@@ -61,7 +61,7 @@
         <w:rPr>
           <w:rFonts w:ascii="Calibri" w:cs="Calibri" w:eastAsia="Calibri" w:hAnsi="Calibri"/>
         </w:rPr>
-        <w:t xml:space="preserve">Vendredi 9 octobre 2026 (3)</w:t>
+        <w:t xml:space="preserve">Vendredi 9 octobre 2026 (4)</w:t>
       </w:r>
     </w:p>
     <w:tbl>
@@ -141,6 +141,66 @@
                 <w:szCs w:val="20"/>
               </w:rPr>
               <w:t xml:space="preserve">Répertoire de dépôt</w:t>
+            </w:r>
+          </w:p>
+        </w:tc>
+      </w:tr>
+      <w:tr>
+        <w:tc>
+          <w:tcPr>
+            <w:tcW w:type="dxa" w:w="5200"/>
+            <w:tcBorders>
+              <w:top w:val="single" w:color="BFBFBF" w:sz="4"/>
+              <w:left w:val="single" w:color="BFBFBF" w:sz="4"/>
+              <w:bottom w:val="single" w:color="BFBFBF" w:sz="4"/>
+              <w:right w:val="single" w:color="BFBFBF" w:sz="4"/>
+            </w:tcBorders>
+            <w:tcMar>
+              <w:top w:type="dxa" w:w="60"/>
+              <w:left w:type="dxa" w:w="100"/>
+              <w:bottom w:type="dxa" w:w="60"/>
+              <w:right w:type="dxa" w:w="100"/>
+            </w:tcMar>
+          </w:tcPr>
+          <w:p>
+            <w:r>
+              <w:rPr>
+                <w:rFonts w:ascii="Calibri" w:cs="Calibri" w:eastAsia="Calibri" w:hAnsi="Calibri"/>
+                <w:b w:val="false"/>
+                <w:bCs w:val="false"/>
+                <w:sz w:val="20"/>
+                <w:szCs w:val="20"/>
+              </w:rPr>
+              <w:t xml:space="preserve">42300 ROANNE - ZAC Foch Sully - VP.pdf (rapport d'expertise BPCE au 23/09/2026)</w:t>
+            </w:r>
+          </w:p>
+        </w:tc>
+        <w:tc>
+          <w:tcPr>
+            <w:tcW w:type="dxa" w:w="4160"/>
+            <w:tcBorders>
+              <w:top w:val="single" w:color="BFBFBF" w:sz="4"/>
+              <w:left w:val="single" w:color="BFBFBF" w:sz="4"/>
+              <w:bottom w:val="single" w:color="BFBFBF" w:sz="4"/>
+              <w:right w:val="single" w:color="BFBFBF" w:sz="4"/>
+            </w:tcBorders>
+            <w:tcMar>
+              <w:top w:type="dxa" w:w="60"/>
+              <w:left w:type="dxa" w:w="100"/>
+              <w:bottom w:type="dxa" w:w="60"/>
+              <w:right w:type="dxa" w:w="100"/>
+            </w:tcMar>
+          </w:tcPr>
+          <w:p>
+            <w:r>
+              <w:rPr>
+                <w:rFonts w:ascii="Calibri" w:cs="Calibri" w:eastAsia="Calibri" w:hAnsi="Calibri"/>
+                <w:b w:val="false"/>
+                <w:bCs w:val="false"/>
+                <w:sz w:val="20"/>
+                <w:szCs w:val="20"/>
+              </w:rPr>
+              <w:t xml:space="preserve">4-COMMERCES MARCHAND DE BIENS / ROANNE-SCI SULLY</w:t>
             </w:r>
           </w:p>
         </w:tc>

</xml_diff>